<commit_message>
Reescribir capítulo V e incorporar capturas reales
</commit_message>
<xml_diff>
--- a/docs/Informe_Integrador_II_Capitulo_V.docx
+++ b/docs/Informe_Integrador_II_Capitulo_V.docx
@@ -8646,6 +8646,8 @@
     <w:p>
       <w:pPr>
         <w:pStyle w:val="Heading3"/>
+        <w:keepNext/>
+        <w:pageBreakBefore/>
       </w:pPr>
       <w:r>
         <w:t>CAPÍTULO V. DESARROLLO E IMPLEMENTACIÓN DE LA SOLUCIÓN</w:t>
@@ -8653,17 +8655,19 @@
     </w:p>
     <w:p>
       <w:pPr>
+        <w:keepLines/>
+        <w:spacing w:line="276" w:lineRule="auto" w:after="140"/>
+        <w:jc w:val="both"/>
+      </w:pPr>
+      <w:r>
+        <w:t>En este capítulo describimos cómo pasamos del diseño del sistema a una versión que ya puede ejecutarse en una computadora local. El trabajo se concentró en completar un flujo verificable: ingresar al sistema, consultar productos, registrar un pedido sin receta y darle seguimiento desde los perfiles de cliente, administrador y repartidor. También se documentan los límites que todavía tiene esta versión, para que las pruebas y capturas representen lo que realmente funciona.</w:t>
+      </w:r>
+    </w:p>
+    <w:p>
+      <w:pPr>
         <w:pStyle w:val="Heading4"/>
-        <w:numPr>
-          <w:ilvl w:val="1"/>
-          <w:numId w:val="6"/>
-        </w:numPr>
-        <w:tabs>
-          <w:tab w:pos="460" w:val="left" w:leader="none"/>
-        </w:tabs>
-        <w:spacing w:line="240" w:lineRule="auto" w:before="247" w:after="0"/>
-        <w:ind w:left="460" w:right="0" w:hanging="460"/>
-        <w:jc w:val="left"/>
+        <w:keepNext/>
+        <w:spacing w:before="240" w:after="100"/>
       </w:pPr>
       <w:r>
         <w:t>5.1. Entorno de desarrollo</w:t>
@@ -8671,122 +8675,29 @@
     </w:p>
     <w:p>
       <w:pPr>
-        <w:pStyle w:val="ListParagraph"/>
-        <w:numPr>
-          <w:ilvl w:val="2"/>
-          <w:numId w:val="6"/>
-        </w:numPr>
-        <w:tabs>
-          <w:tab w:pos="360" w:val="left" w:leader="none"/>
-        </w:tabs>
-        <w:spacing w:line="240" w:lineRule="auto" w:before="49" w:after="0"/>
-        <w:ind w:left="360" w:right="0" w:hanging="360"/>
-        <w:jc w:val="left"/>
-        <w:rPr>
-          <w:sz w:val="22"/>
-        </w:rPr>
-      </w:pPr>
-      <w:r>
-        <w:t>IDE utilizado. Se ha previsto Visual Studio Code para editar el proyecto Java y las páginas web. La ejecución local se realiza con terminal y el wrapper de Maven incluido en el repositorio. La instalación concreta del IDE en el equipo del estudiante queda por documentar con una captura.</w:t>
-      </w:r>
-    </w:p>
-    <w:p>
-      <w:pPr>
-        <w:pStyle w:val="ListParagraph"/>
-        <w:numPr>
-          <w:ilvl w:val="2"/>
-          <w:numId w:val="6"/>
-        </w:numPr>
-        <w:tabs>
-          <w:tab w:pos="360" w:val="left" w:leader="none"/>
-        </w:tabs>
-        <w:spacing w:line="240" w:lineRule="auto" w:before="34" w:after="0"/>
-        <w:ind w:left="360" w:right="0" w:hanging="360"/>
-        <w:jc w:val="left"/>
-        <w:rPr>
-          <w:sz w:val="22"/>
-        </w:rPr>
-      </w:pPr>
-      <w:r>
-        <w:t>Lenguajes. El servidor está desarrollado en Java 21; la interfaz usa HTML5, CSS3 y JavaScript nativo. SQL define la estructura y los datos iniciales de MySQL.</w:t>
-      </w:r>
-    </w:p>
-    <w:p>
-      <w:pPr>
-        <w:pStyle w:val="ListParagraph"/>
-        <w:numPr>
-          <w:ilvl w:val="2"/>
-          <w:numId w:val="6"/>
-        </w:numPr>
-        <w:tabs>
-          <w:tab w:pos="360" w:val="left" w:leader="none"/>
-        </w:tabs>
-        <w:spacing w:line="240" w:lineRule="auto" w:before="37" w:after="0"/>
-        <w:ind w:left="360" w:right="0" w:hanging="360"/>
-        <w:jc w:val="left"/>
-        <w:rPr>
-          <w:sz w:val="22"/>
-        </w:rPr>
-      </w:pPr>
-      <w:r>
-        <w:t>Framework y bibliotecas. El servidor utiliza Spring Boot 4.0.8, Spring Web MVC, Spring Data JPA, Spring Security y Maven. BCrypt protege las contraseñas y JWT identifica las sesiones. El frontend no utiliza un framework de interfaz.</w:t>
-      </w:r>
-    </w:p>
-    <w:p>
-      <w:pPr>
-        <w:pStyle w:val="ListParagraph"/>
-        <w:numPr>
-          <w:ilvl w:val="2"/>
-          <w:numId w:val="6"/>
-        </w:numPr>
-        <w:tabs>
-          <w:tab w:pos="360" w:val="left" w:leader="none"/>
-        </w:tabs>
-        <w:spacing w:line="240" w:lineRule="auto" w:before="37" w:after="0"/>
-        <w:ind w:left="360" w:right="0" w:hanging="360"/>
-        <w:jc w:val="left"/>
-        <w:rPr>
-          <w:sz w:val="22"/>
-        </w:rPr>
-      </w:pPr>
-      <w:r>
-        <w:t>Sistema operativo. El equipo donde se verificó este avance ejecuta Linux. El sistema operativo del equipo personal del estudiante aún debe confirmarse; el repositorio incluye mvnw y mvnw.cmd para facilitar la ejecución en Linux/macOS y Windows.</w:t>
-      </w:r>
-    </w:p>
-    <w:p>
-      <w:pPr>
-        <w:pStyle w:val="ListParagraph"/>
-        <w:numPr>
-          <w:ilvl w:val="2"/>
-          <w:numId w:val="6"/>
-        </w:numPr>
-        <w:tabs>
-          <w:tab w:pos="360" w:val="left" w:leader="none"/>
-        </w:tabs>
-        <w:spacing w:line="240" w:lineRule="auto" w:before="36" w:after="0"/>
-        <w:ind w:left="360" w:right="0" w:hanging="360"/>
-        <w:jc w:val="left"/>
-        <w:rPr>
-          <w:sz w:val="22"/>
-        </w:rPr>
-      </w:pPr>
-      <w:r>
-        <w:t>Herramientas complementarias. Git/GitHub controlan las versiones; MySQL 8 es la base de datos prevista. Las pruebas automáticas usan JUnit, MockMvc y H2 en memoria. Firefox y un servidor HTTP local permitieron revisar la interfaz; un perfil H2 local permitió comprobar la API sin disponer todavía de MySQL en este entorno.</w:t>
+        <w:keepLines/>
+        <w:spacing w:line="276" w:lineRule="auto" w:after="140"/>
+        <w:jc w:val="both"/>
+      </w:pPr>
+      <w:r>
+        <w:t>El proyecto está organizado para trabajarse en Visual Studio Code, que es el IDE elegido para el curso. La aplicación separa el frontend, desarrollado con HTML, CSS y JavaScript, del backend, construido con Java 21 y Spring Boot 4.0.8. Maven se ejecuta mediante el wrapper incluido en el repositorio, por lo que no es necesario configurar una instalación global de Maven para compilar o correr las pruebas.</w:t>
+      </w:r>
+    </w:p>
+    <w:p>
+      <w:pPr>
+        <w:keepLines/>
+        <w:spacing w:line="276" w:lineRule="auto" w:after="140"/>
+        <w:jc w:val="both"/>
+      </w:pPr>
+      <w:r>
+        <w:t>La verificación de este avance se realizó en Ubuntu 26.04.1 LTS con el frontend y el backend levantados en la misma computadora. Para las pruebas automáticas y las capturas de las pantallas se utilizó H2 en memoria. MySQL 8 es la base prevista para la entrega local del proyecto, pero todavía falta repetir el recorrido completo con una instancia MySQL del equipo. Git, GitHub, un servidor HTTP local y el navegador completaron las herramientas de trabajo.</w:t>
       </w:r>
     </w:p>
     <w:p>
       <w:pPr>
         <w:pStyle w:val="Heading4"/>
-        <w:numPr>
-          <w:ilvl w:val="1"/>
-          <w:numId w:val="6"/>
-        </w:numPr>
-        <w:tabs>
-          <w:tab w:pos="460" w:val="left" w:leader="none"/>
-        </w:tabs>
-        <w:spacing w:line="240" w:lineRule="auto" w:before="236" w:after="0"/>
-        <w:ind w:left="460" w:right="0" w:hanging="460"/>
-        <w:jc w:val="left"/>
+        <w:keepNext/>
+        <w:spacing w:before="240" w:after="100"/>
       </w:pPr>
       <w:r>
         <w:t>5.2. Gestión del código fuente</w:t>
@@ -8794,101 +8705,83 @@
     </w:p>
     <w:p>
       <w:pPr>
-        <w:pStyle w:val="ListParagraph"/>
-        <w:numPr>
-          <w:ilvl w:val="2"/>
-          <w:numId w:val="6"/>
-        </w:numPr>
-        <w:tabs>
-          <w:tab w:pos="360" w:val="left" w:leader="none"/>
-        </w:tabs>
-        <w:spacing w:line="240" w:lineRule="auto" w:before="47" w:after="0"/>
-        <w:ind w:left="360" w:right="0" w:hanging="360"/>
-        <w:jc w:val="left"/>
-        <w:rPr>
-          <w:sz w:val="22"/>
-        </w:rPr>
-      </w:pPr>
-      <w:r>
-        <w:t>Repositorio. El código y la documentación se encuentran en https://github.com/SandroBravo7/Farmacia-Mery-Salud, rama desarrollador/GDvega. El proyecto anterior https://github.com/LIUNKS/farma-ya se revisó como antecedente; este capítulo describe el repositorio actual.</w:t>
-      </w:r>
-    </w:p>
-    <w:p>
-      <w:pPr>
-        <w:pStyle w:val="ListParagraph"/>
-        <w:numPr>
-          <w:ilvl w:val="2"/>
-          <w:numId w:val="6"/>
-        </w:numPr>
-        <w:tabs>
-          <w:tab w:pos="360" w:val="left" w:leader="none"/>
-        </w:tabs>
-        <w:spacing w:line="240" w:lineRule="auto" w:before="37" w:after="0"/>
-        <w:ind w:left="360" w:right="0" w:hanging="360"/>
-        <w:jc w:val="left"/>
-        <w:rPr>
-          <w:sz w:val="22"/>
-        </w:rPr>
-      </w:pPr>
-      <w:r>
-        <w:t>Organización. backend/ reúne controladores, servicios, entidades, repositorios, seguridad, configuración y pruebas; frontend/ contiene las páginas y recursos estáticos; database/schema.sql contiene el esquema para una base MySQL nueva; docs/ conserva este informe, la matriz de pruebas y la medición local. El archivo README.md explica la reproducción del entorno.</w:t>
-      </w:r>
-    </w:p>
-    <w:p>
-      <w:pPr>
-        <w:pStyle w:val="ListParagraph"/>
-        <w:numPr>
-          <w:ilvl w:val="2"/>
-          <w:numId w:val="6"/>
-        </w:numPr>
-        <w:tabs>
-          <w:tab w:pos="360" w:val="left" w:leader="none"/>
-        </w:tabs>
-        <w:spacing w:line="240" w:lineRule="auto" w:before="36" w:after="0"/>
-        <w:ind w:left="360" w:right="0" w:hanging="360"/>
-        <w:jc w:val="left"/>
-        <w:rPr>
-          <w:sz w:val="22"/>
-        </w:rPr>
-      </w:pPr>
-      <w:r>
-        <w:t>Ramas. Este avance se prepara y publica en desarrollador/GDvega. La existencia de otras ramas en el repositorio no implica que se hayan utilizado para esta implementación; no se atribuyen cambios a ellas.</w:t>
-      </w:r>
-    </w:p>
-    <w:p>
-      <w:pPr>
-        <w:pStyle w:val="ListParagraph"/>
-        <w:numPr>
-          <w:ilvl w:val="2"/>
-          <w:numId w:val="6"/>
-        </w:numPr>
-        <w:tabs>
-          <w:tab w:pos="360" w:val="left" w:leader="none"/>
-        </w:tabs>
-        <w:spacing w:line="240" w:lineRule="auto" w:before="37" w:after="0"/>
-        <w:ind w:left="360" w:right="0" w:hanging="360"/>
-        <w:jc w:val="left"/>
-        <w:rPr>
-          <w:sz w:val="22"/>
-        </w:rPr>
-      </w:pPr>
-      <w:r>
-        <w:t>Control de versiones. Git registra los cambios de código, esquema y documentación en la rama de trabajo. No se incorporan credenciales ni artefactos de compilación. La instalación se documenta para que otra persona pueda clonar la rama y configurar sus propias variables de entorno.</w:t>
+        <w:keepLines/>
+        <w:spacing w:line="276" w:lineRule="auto" w:after="140"/>
+        <w:jc w:val="both"/>
+      </w:pPr>
+      <w:r>
+        <w:t>El código se conserva en el repositorio Farmacia-Mery-Salud de GitHub. Para este avance trabajamos en la rama desarrollador/GDvega. Revisamos el proyecto de Integrador I, farma-ya, como antecedente para entender el negocio y los módulos que se habían propuesto, pero la implementación que se explica aquí corresponde al repositorio actual.</w:t>
+      </w:r>
+    </w:p>
+    <w:p>
+      <w:pPr>
+        <w:keepLines/>
+        <w:spacing w:line="276" w:lineRule="auto" w:after="140"/>
+        <w:jc w:val="both"/>
+      </w:pPr>
+      <w:r>
+        <w:t>La organización del repositorio facilita ubicar cada parte: backend/ contiene la API, la seguridad, los servicios, las entidades y las pruebas; frontend/ reúne las páginas y sus archivos JavaScript y CSS; database/ contiene el esquema SQL; y docs/ guarda el informe, la matriz y las evidencias. El README incluye los pasos para clonar la rama y configurar el entorno. Las contraseñas se pasan mediante variables de entorno y no se suben junto al código. El avance quedó registrado en el commit 700ead3, visible en la figura 5.1.</w:t>
+      </w:r>
+    </w:p>
+    <w:p>
+      <w:pPr>
+        <w:keepNext/>
+        <w:spacing w:before="160" w:after="60"/>
+        <w:jc w:val="center"/>
+      </w:pPr>
+      <w:r>
+        <w:drawing>
+          <wp:inline>
+            <wp:extent cx="5394960" cy="3159567"/>
+            <wp:docPr id="1" name="Picture 1"/>
+            <wp:cNvGraphicFramePr>
+              <a:graphicFrameLocks noChangeAspect="1"/>
+            </wp:cNvGraphicFramePr>
+            <a:graphic>
+              <a:graphicData uri="http://schemas.openxmlformats.org/drawingml/2006/picture">
+                <pic:pic>
+                  <pic:nvPicPr>
+                    <pic:cNvPr id="0" name="06_repositorio_github.png"/>
+                    <pic:cNvPicPr/>
+                  </pic:nvPicPr>
+                  <pic:blipFill>
+                    <a:blip r:embed="rId6"/>
+                    <a:stretch>
+                      <a:fillRect/>
+                    </a:stretch>
+                  </pic:blipFill>
+                  <pic:spPr>
+                    <a:xfrm>
+                      <a:off x="0" y="0"/>
+                      <a:ext cx="5394960" cy="3159567"/>
+                    </a:xfrm>
+                    <a:prstGeom prst="rect"/>
+                  </pic:spPr>
+                </pic:pic>
+              </a:graphicData>
+            </a:graphic>
+          </wp:inline>
+        </w:drawing>
+      </w:r>
+    </w:p>
+    <w:p>
+      <w:pPr>
+        <w:spacing w:after="240"/>
+        <w:jc w:val="center"/>
+      </w:pPr>
+      <w:r>
+        <w:rPr>
+          <w:i/>
+          <w:sz w:val="18"/>
+        </w:rPr>
+        <w:t>Figura 5.1. Rama desarrollador/GDvega en GitHub con el código y la documentación del avance. Fuente: captura real del repositorio, 03/10/2026.</w:t>
       </w:r>
     </w:p>
     <w:p>
       <w:pPr>
         <w:pStyle w:val="Heading4"/>
-        <w:numPr>
-          <w:ilvl w:val="1"/>
-          <w:numId w:val="6"/>
-        </w:numPr>
-        <w:tabs>
-          <w:tab w:pos="460" w:val="left" w:leader="none"/>
-        </w:tabs>
-        <w:spacing w:line="240" w:lineRule="auto" w:before="236" w:after="0"/>
-        <w:ind w:left="460" w:right="0" w:hanging="460"/>
-        <w:jc w:val="left"/>
+        <w:keepNext/>
+        <w:spacing w:before="240" w:after="100"/>
       </w:pPr>
       <w:r>
         <w:t>5.3. Implementación del Front-End</w:t>
@@ -8896,122 +8789,147 @@
     </w:p>
     <w:p>
       <w:pPr>
-        <w:pStyle w:val="ListParagraph"/>
-        <w:numPr>
-          <w:ilvl w:val="2"/>
-          <w:numId w:val="6"/>
-        </w:numPr>
-        <w:tabs>
-          <w:tab w:pos="360" w:val="left" w:leader="none"/>
-        </w:tabs>
-        <w:spacing w:line="240" w:lineRule="auto" w:before="47" w:after="0"/>
-        <w:ind w:left="360" w:right="0" w:hanging="360"/>
-        <w:jc w:val="left"/>
-        <w:rPr>
-          <w:sz w:val="22"/>
-        </w:rPr>
-      </w:pPr>
-      <w:r>
-        <w:t>Conversión de prototipos. Las pantallas propuestas se materializaron en páginas HTML y estilos CSS para inicio, catálogo, acceso, pedidos, administración y reparto. La estructura adapta contenidos a distintos anchos de pantalla; la revisión visual local confirma la carga del catálogo y sus existencias desde la API.</w:t>
-      </w:r>
-    </w:p>
-    <w:p>
-      <w:pPr>
-        <w:pStyle w:val="ListParagraph"/>
-        <w:numPr>
-          <w:ilvl w:val="2"/>
-          <w:numId w:val="6"/>
-        </w:numPr>
-        <w:tabs>
-          <w:tab w:pos="360" w:val="left" w:leader="none"/>
-        </w:tabs>
-        <w:spacing w:line="240" w:lineRule="auto" w:before="36" w:after="0"/>
-        <w:ind w:left="360" w:right="0" w:hanging="360"/>
-        <w:jc w:val="left"/>
-        <w:rPr>
-          <w:sz w:val="22"/>
-        </w:rPr>
-      </w:pPr>
-      <w:r>
-        <w:t>Componentes principales. Los scripts compartidos gestionan la sesión, las solicitudes HTTP y el carrito. La portada y el catálogo renderizan productos; auth.html registra o autentica clientes; pedidos.html muestra el historial; admin.html presenta inventario, usuarios y pedidos; repartidor.html presenta las entregas asignadas.</w:t>
-      </w:r>
-    </w:p>
-    <w:p>
-      <w:pPr>
-        <w:pStyle w:val="ListParagraph"/>
-        <w:numPr>
-          <w:ilvl w:val="2"/>
-          <w:numId w:val="6"/>
-        </w:numPr>
-        <w:tabs>
-          <w:tab w:pos="360" w:val="left" w:leader="none"/>
-        </w:tabs>
-        <w:spacing w:line="240" w:lineRule="auto" w:before="37" w:after="0"/>
-        <w:ind w:left="360" w:right="0" w:hanging="360"/>
-        <w:jc w:val="left"/>
-        <w:rPr>
-          <w:sz w:val="22"/>
-        </w:rPr>
-      </w:pPr>
-      <w:r>
-        <w:t>Navegación. El menú dirige a las secciones públicas y cada rol llega a su pantalla al iniciar sesión. Las páginas protegidas comprueban la sesión en el cliente, mientras que Spring Security aplica la autorización efectiva en el servidor.</w:t>
-      </w:r>
-    </w:p>
-    <w:p>
-      <w:pPr>
-        <w:pStyle w:val="ListParagraph"/>
-        <w:numPr>
-          <w:ilvl w:val="2"/>
-          <w:numId w:val="6"/>
-        </w:numPr>
-        <w:tabs>
-          <w:tab w:pos="360" w:val="left" w:leader="none"/>
-        </w:tabs>
-        <w:spacing w:line="240" w:lineRule="auto" w:before="37" w:after="0"/>
-        <w:ind w:left="360" w:right="0" w:hanging="360"/>
-        <w:jc w:val="left"/>
-        <w:rPr>
-          <w:sz w:val="22"/>
-        </w:rPr>
-      </w:pPr>
-      <w:r>
-        <w:t>Formularios. El acceso recoge correo y contraseña; el registro añade nombre y teléfono. El checkout solicita datos de entrega y envía identificadores y cantidades de productos. El panel de administración permite altas y actualizaciones compatibles con la API. El pago en línea no está implementado.</w:t>
-      </w:r>
-    </w:p>
-    <w:p>
-      <w:pPr>
-        <w:pStyle w:val="ListParagraph"/>
-        <w:numPr>
-          <w:ilvl w:val="2"/>
-          <w:numId w:val="6"/>
-        </w:numPr>
-        <w:tabs>
-          <w:tab w:pos="360" w:val="left" w:leader="none"/>
-        </w:tabs>
-        <w:spacing w:line="240" w:lineRule="auto" w:before="36" w:after="0"/>
-        <w:ind w:left="360" w:right="0" w:hanging="360"/>
-        <w:jc w:val="left"/>
-        <w:rPr>
-          <w:sz w:val="22"/>
-        </w:rPr>
-      </w:pPr>
-      <w:r>
-        <w:t>Validaciones. El navegador valida campos requeridos y formatos; el servidor vuelve a validar credenciales, rol, existencias, tipo de entrega y transición de estados. El total se recalcula con precios del servidor. Los pedidos reales con productos que requieren receta se bloquean hasta implementar la revisión de archivos; las categorías y algunas acciones de perfil siguen disponibles solo en la demostración local del navegador.</w:t>
+        <w:keepLines/>
+        <w:spacing w:line="276" w:lineRule="auto" w:after="140"/>
+        <w:jc w:val="both"/>
+      </w:pPr>
+      <w:r>
+        <w:t>A partir de los prototipos del primer avance se construyeron las pantallas de inicio, catálogo, acceso, historial de pedidos, administración y reparto. Se mantuvo una navegación sencilla entre las secciones públicas y los módulos de cada rol. La sesión del usuario se conserva en el navegador para enviar el token en las solicitudes a la API; aun así, la protección de los datos depende de las reglas implementadas en el servidor.</w:t>
+      </w:r>
+    </w:p>
+    <w:p>
+      <w:pPr>
+        <w:keepLines/>
+        <w:spacing w:line="276" w:lineRule="auto" w:after="140"/>
+        <w:jc w:val="both"/>
+      </w:pPr>
+      <w:r>
+        <w:t>El catálogo consulta los productos disponibles y muestra nombre, presentación, precio y stock. La búsqueda por nombre o principio activo y los filtros se aplican en la interfaz sobre la lista recibida. En la figura 5.2 se observan los cuatro productos cargados en el entorno local de prueba; la figura 5.3 muestra el resultado al buscar “paracetamol”. Esas capturas proceden de la API con H2, no del modo de demostración del navegador.</w:t>
+      </w:r>
+    </w:p>
+    <w:p>
+      <w:pPr>
+        <w:keepNext/>
+        <w:spacing w:before="160" w:after="60"/>
+        <w:jc w:val="center"/>
+      </w:pPr>
+      <w:r>
+        <w:drawing>
+          <wp:inline>
+            <wp:extent cx="5394960" cy="3001588"/>
+            <wp:docPr id="2" name="Picture 2"/>
+            <wp:cNvGraphicFramePr>
+              <a:graphicFrameLocks noChangeAspect="1"/>
+            </wp:cNvGraphicFramePr>
+            <a:graphic>
+              <a:graphicData uri="http://schemas.openxmlformats.org/drawingml/2006/picture">
+                <pic:pic>
+                  <pic:nvPicPr>
+                    <pic:cNvPr id="0" name="01_catalogo_h2.png"/>
+                    <pic:cNvPicPr/>
+                  </pic:nvPicPr>
+                  <pic:blipFill>
+                    <a:blip r:embed="rId7"/>
+                    <a:stretch>
+                      <a:fillRect/>
+                    </a:stretch>
+                  </pic:blipFill>
+                  <pic:spPr>
+                    <a:xfrm>
+                      <a:off x="0" y="0"/>
+                      <a:ext cx="5394960" cy="3001588"/>
+                    </a:xfrm>
+                    <a:prstGeom prst="rect"/>
+                  </pic:spPr>
+                </pic:pic>
+              </a:graphicData>
+            </a:graphic>
+          </wp:inline>
+        </w:drawing>
+      </w:r>
+    </w:p>
+    <w:p>
+      <w:pPr>
+        <w:spacing w:after="240"/>
+        <w:jc w:val="center"/>
+      </w:pPr>
+      <w:r>
+        <w:rPr>
+          <w:i/>
+          <w:sz w:val="18"/>
+        </w:rPr>
+        <w:t>Figura 5.2. Catálogo conectado a la API local, con precio y existencias de los productos de prueba. Fuente: captura propia con H2, 03/10/2026.</w:t>
+      </w:r>
+    </w:p>
+    <w:p>
+      <w:pPr>
+        <w:keepNext/>
+        <w:spacing w:before="160" w:after="60"/>
+        <w:jc w:val="center"/>
+      </w:pPr>
+      <w:r>
+        <w:drawing>
+          <wp:inline>
+            <wp:extent cx="5394960" cy="2725126"/>
+            <wp:docPr id="3" name="Picture 3"/>
+            <wp:cNvGraphicFramePr>
+              <a:graphicFrameLocks noChangeAspect="1"/>
+            </wp:cNvGraphicFramePr>
+            <a:graphic>
+              <a:graphicData uri="http://schemas.openxmlformats.org/drawingml/2006/picture">
+                <pic:pic>
+                  <pic:nvPicPr>
+                    <pic:cNvPr id="0" name="02_busqueda_h2.png"/>
+                    <pic:cNvPicPr/>
+                  </pic:nvPicPr>
+                  <pic:blipFill>
+                    <a:blip r:embed="rId8"/>
+                    <a:stretch>
+                      <a:fillRect/>
+                    </a:stretch>
+                  </pic:blipFill>
+                  <pic:spPr>
+                    <a:xfrm>
+                      <a:off x="0" y="0"/>
+                      <a:ext cx="5394960" cy="2725126"/>
+                    </a:xfrm>
+                    <a:prstGeom prst="rect"/>
+                  </pic:spPr>
+                </pic:pic>
+              </a:graphicData>
+            </a:graphic>
+          </wp:inline>
+        </w:drawing>
+      </w:r>
+    </w:p>
+    <w:p>
+      <w:pPr>
+        <w:spacing w:after="240"/>
+        <w:jc w:val="center"/>
+      </w:pPr>
+      <w:r>
+        <w:rPr>
+          <w:i/>
+          <w:sz w:val="18"/>
+        </w:rPr>
+        <w:t>Figura 5.3. Búsqueda de “paracetamol” en el catálogo conectado. Fuente: captura propia con H2, 03/10/2026.</w:t>
+      </w:r>
+    </w:p>
+    <w:p>
+      <w:pPr>
+        <w:keepLines/>
+        <w:spacing w:line="276" w:lineRule="auto" w:after="140"/>
+        <w:jc w:val="both"/>
+      </w:pPr>
+      <w:r>
+        <w:t>Los formularios de acceso y registro validan datos obligatorios antes de enviarlos. El checkout recoge la modalidad de entrega y los productos seleccionados, pero el total definitivo se calcula en el backend para evitar que una modificación del navegador cambie el precio. En la versión conectada se bloquea la confirmación de productos con receta porque todavía no existe un flujo completo para almacenar y validar el archivo. El modo ?demo=1 permite recorrer otras pantallas con datos ficticios; sus resultados no se consideran evidencia de persistencia real.</w:t>
       </w:r>
     </w:p>
     <w:p>
       <w:pPr>
         <w:pStyle w:val="Heading4"/>
-        <w:numPr>
-          <w:ilvl w:val="1"/>
-          <w:numId w:val="6"/>
-        </w:numPr>
-        <w:tabs>
-          <w:tab w:pos="460" w:val="left" w:leader="none"/>
-        </w:tabs>
-        <w:spacing w:line="240" w:lineRule="auto" w:before="236" w:after="0"/>
-        <w:ind w:left="460" w:right="0" w:hanging="460"/>
-        <w:jc w:val="left"/>
+        <w:keepNext/>
+        <w:spacing w:before="240" w:after="100"/>
       </w:pPr>
       <w:r>
         <w:t>5.4. Implementación del Back-End</w:t>
@@ -9019,101 +8937,147 @@
     </w:p>
     <w:p>
       <w:pPr>
-        <w:pStyle w:val="ListParagraph"/>
-        <w:numPr>
-          <w:ilvl w:val="2"/>
-          <w:numId w:val="6"/>
-        </w:numPr>
-        <w:tabs>
-          <w:tab w:pos="360" w:val="left" w:leader="none"/>
-        </w:tabs>
-        <w:spacing w:line="240" w:lineRule="auto" w:before="48" w:after="0"/>
-        <w:ind w:left="360" w:right="0" w:hanging="360"/>
-        <w:jc w:val="left"/>
-        <w:rPr>
-          <w:sz w:val="22"/>
-        </w:rPr>
-      </w:pPr>
-      <w:r>
-        <w:t>Servicios. La API expone autenticación y registro, catálogo e inventario, usuarios, pedidos e historial privado, asignación y avance de entregas. Las rutas administrativas requieren rol ADMIN; un repartidor solo puede actualizar los pedidos que tiene asignados.</w:t>
-      </w:r>
-    </w:p>
-    <w:p>
-      <w:pPr>
-        <w:pStyle w:val="ListParagraph"/>
-        <w:numPr>
-          <w:ilvl w:val="2"/>
-          <w:numId w:val="6"/>
-        </w:numPr>
-        <w:tabs>
-          <w:tab w:pos="360" w:val="left" w:leader="none"/>
-        </w:tabs>
-        <w:spacing w:line="240" w:lineRule="auto" w:before="36" w:after="0"/>
-        <w:ind w:left="360" w:right="0" w:hanging="360"/>
-        <w:jc w:val="left"/>
-        <w:rPr>
-          <w:sz w:val="22"/>
-        </w:rPr>
-      </w:pPr>
-      <w:r>
-        <w:t>Lógica de negocio. Las contraseñas se guardan con BCrypt y el acceso emite JWT. En una transacción, el servicio de pedidos bloquea los productos, valida stock, calcula el total y guarda cabecera y detalles; la cancelación repone existencias. Un código ORD identifica la orden. No se procesa un cobro ni se valida una receta en el servidor.</w:t>
-      </w:r>
-    </w:p>
-    <w:p>
-      <w:pPr>
-        <w:pStyle w:val="ListParagraph"/>
-        <w:numPr>
-          <w:ilvl w:val="2"/>
-          <w:numId w:val="6"/>
-        </w:numPr>
-        <w:tabs>
-          <w:tab w:pos="360" w:val="left" w:leader="none"/>
-        </w:tabs>
-        <w:spacing w:line="240" w:lineRule="auto" w:before="36" w:after="0"/>
-        <w:ind w:left="360" w:right="0" w:hanging="360"/>
-        <w:jc w:val="left"/>
-        <w:rPr>
-          <w:sz w:val="22"/>
-        </w:rPr>
-      </w:pPr>
-      <w:r>
-        <w:t>API REST. Entre los endpoints principales están POST /api/auth/login, POST /api/auth/register, GET /api/productos, POST /api/productos, POST /api/pedidos, GET /api/pedidos/mios, GET /api/pedidos/asignados y PUT /api/pedidos/{id}/estado. Las respuestas y restricciones se comprueban en backend/src/test/java/com/merysalud/ApiFlowTests.java.</w:t>
-      </w:r>
-    </w:p>
-    <w:p>
-      <w:pPr>
-        <w:pStyle w:val="ListParagraph"/>
-        <w:numPr>
-          <w:ilvl w:val="2"/>
-          <w:numId w:val="6"/>
-        </w:numPr>
-        <w:tabs>
-          <w:tab w:pos="360" w:val="left" w:leader="none"/>
-        </w:tabs>
-        <w:spacing w:line="240" w:lineRule="auto" w:before="37" w:after="0"/>
-        <w:ind w:left="360" w:right="0" w:hanging="360"/>
-        <w:jc w:val="left"/>
-        <w:rPr>
-          <w:sz w:val="22"/>
-        </w:rPr>
-      </w:pPr>
-      <w:r>
-        <w:t>Integración. El frontend envía JSON a http://localhost:8080 y adjunta el token Bearer cuando hay sesión. Las pantallas reciben productos, pedidos y estados desde la API. El parámetro ?demo=1 ejecuta únicamente una simulación en el navegador y no demuestra persistencia en la base de datos.</w:t>
+        <w:keepLines/>
+        <w:spacing w:line="276" w:lineRule="auto" w:after="140"/>
+        <w:jc w:val="both"/>
+      </w:pPr>
+      <w:r>
+        <w:t>La API REST se divide en módulos de autenticación, productos, usuarios y pedidos. En el inicio de sesión se compara la contraseña con su hash BCrypt y, si las credenciales son correctas, se emite un token JWT. Spring Security revisa ese token y el rol antes de permitir operaciones administrativas o de reparto. Por ejemplo, un cliente puede consultar el catálogo y sus propios pedidos, pero no puede modificar el inventario ni ver la lista completa de usuarios.</w:t>
+      </w:r>
+    </w:p>
+    <w:p>
+      <w:pPr>
+        <w:keepLines/>
+        <w:spacing w:line="276" w:lineRule="auto" w:after="140"/>
+        <w:jc w:val="both"/>
+      </w:pPr>
+      <w:r>
+        <w:t>La parte más importante de este avance es el registro del pedido. El cliente envía identificadores y cantidades; el servidor comprueba la existencia de cada producto, bloquea las filas mientras descuenta el stock, toma los precios guardados y registra cabecera y detalle en una transacción. Si no hay unidades suficientes, devuelve un error y no deja el pedido a medias. También se implementaron la asignación del repartidor y los cambios permitidos de estado. Una cancelación repone las unidades. El sistema no cobra en línea: el enlace de WhatsApp se mantiene como medio de contacto, no como comprobante de pago.</w:t>
+      </w:r>
+    </w:p>
+    <w:p>
+      <w:pPr>
+        <w:keepLines/>
+        <w:spacing w:line="276" w:lineRule="auto" w:after="140"/>
+        <w:jc w:val="both"/>
+      </w:pPr>
+      <w:r>
+        <w:t>Las pruebas con MockMvc comprueban contraseñas, restricciones por rol, cálculo del total, stock e historial, además del avance de una entrega. En la figura 5.4 se ve el pedido de prueba desde el panel administrador y en la figura 5.5 el mismo código en el historial del cliente. Ambas pantallas consultaron la API local con H2.</w:t>
+      </w:r>
+    </w:p>
+    <w:p>
+      <w:pPr>
+        <w:keepNext/>
+        <w:spacing w:before="160" w:after="60"/>
+        <w:jc w:val="center"/>
+      </w:pPr>
+      <w:r>
+        <w:drawing>
+          <wp:inline>
+            <wp:extent cx="5394960" cy="1737762"/>
+            <wp:docPr id="4" name="Picture 4"/>
+            <wp:cNvGraphicFramePr>
+              <a:graphicFrameLocks noChangeAspect="1"/>
+            </wp:cNvGraphicFramePr>
+            <a:graphic>
+              <a:graphicData uri="http://schemas.openxmlformats.org/drawingml/2006/picture">
+                <pic:pic>
+                  <pic:nvPicPr>
+                    <pic:cNvPr id="0" name="04_pedidos_admin_h2.png"/>
+                    <pic:cNvPicPr/>
+                  </pic:nvPicPr>
+                  <pic:blipFill>
+                    <a:blip r:embed="rId9"/>
+                    <a:stretch>
+                      <a:fillRect/>
+                    </a:stretch>
+                  </pic:blipFill>
+                  <pic:spPr>
+                    <a:xfrm>
+                      <a:off x="0" y="0"/>
+                      <a:ext cx="5394960" cy="1737762"/>
+                    </a:xfrm>
+                    <a:prstGeom prst="rect"/>
+                  </pic:spPr>
+                </pic:pic>
+              </a:graphicData>
+            </a:graphic>
+          </wp:inline>
+        </w:drawing>
+      </w:r>
+    </w:p>
+    <w:p>
+      <w:pPr>
+        <w:spacing w:after="240"/>
+        <w:jc w:val="center"/>
+      </w:pPr>
+      <w:r>
+        <w:rPr>
+          <w:i/>
+          <w:sz w:val="18"/>
+        </w:rPr>
+        <w:t>Figura 5.4. Pedido de prueba registrado y visible en el panel administrador. Fuente: captura propia con H2, 03/10/2026.</w:t>
+      </w:r>
+    </w:p>
+    <w:p>
+      <w:pPr>
+        <w:keepNext/>
+        <w:spacing w:before="160" w:after="60"/>
+        <w:jc w:val="center"/>
+      </w:pPr>
+      <w:r>
+        <w:drawing>
+          <wp:inline>
+            <wp:extent cx="5394960" cy="2567148"/>
+            <wp:docPr id="5" name="Picture 5"/>
+            <wp:cNvGraphicFramePr>
+              <a:graphicFrameLocks noChangeAspect="1"/>
+            </wp:cNvGraphicFramePr>
+            <a:graphic>
+              <a:graphicData uri="http://schemas.openxmlformats.org/drawingml/2006/picture">
+                <pic:pic>
+                  <pic:nvPicPr>
+                    <pic:cNvPr id="0" name="05_historial_cliente_h2.png"/>
+                    <pic:cNvPicPr/>
+                  </pic:nvPicPr>
+                  <pic:blipFill>
+                    <a:blip r:embed="rId10"/>
+                    <a:stretch>
+                      <a:fillRect/>
+                    </a:stretch>
+                  </pic:blipFill>
+                  <pic:spPr>
+                    <a:xfrm>
+                      <a:off x="0" y="0"/>
+                      <a:ext cx="5394960" cy="2567148"/>
+                    </a:xfrm>
+                    <a:prstGeom prst="rect"/>
+                  </pic:spPr>
+                </pic:pic>
+              </a:graphicData>
+            </a:graphic>
+          </wp:inline>
+        </w:drawing>
+      </w:r>
+    </w:p>
+    <w:p>
+      <w:pPr>
+        <w:spacing w:after="240"/>
+        <w:jc w:val="center"/>
+      </w:pPr>
+      <w:r>
+        <w:rPr>
+          <w:i/>
+          <w:sz w:val="18"/>
+        </w:rPr>
+        <w:t>Figura 5.5. El mismo pedido visto desde el historial del cliente. Fuente: captura propia con H2, 03/10/2026.</w:t>
       </w:r>
     </w:p>
     <w:p>
       <w:pPr>
         <w:pStyle w:val="Heading4"/>
-        <w:numPr>
-          <w:ilvl w:val="1"/>
-          <w:numId w:val="6"/>
-        </w:numPr>
-        <w:tabs>
-          <w:tab w:pos="460" w:val="left" w:leader="none"/>
-        </w:tabs>
-        <w:spacing w:line="240" w:lineRule="auto" w:before="236" w:after="0"/>
-        <w:ind w:left="460" w:right="0" w:hanging="460"/>
-        <w:jc w:val="left"/>
+        <w:keepNext/>
+        <w:spacing w:before="240" w:after="100"/>
       </w:pPr>
       <w:r>
         <w:t>5.5. Integración con base de datos</w:t>
@@ -9121,38 +9085,29 @@
     </w:p>
     <w:p>
       <w:pPr>
-        <w:pStyle w:val="ListParagraph"/>
-        <w:numPr>
-          <w:ilvl w:val="2"/>
-          <w:numId w:val="6"/>
-        </w:numPr>
-        <w:tabs>
-          <w:tab w:pos="360" w:val="left" w:leader="none"/>
-        </w:tabs>
-        <w:spacing w:line="240" w:lineRule="auto" w:before="47" w:after="0"/>
-        <w:ind w:left="360" w:right="0" w:hanging="360"/>
-        <w:jc w:val="left"/>
-        <w:rPr>
-          <w:sz w:val="22"/>
-        </w:rPr>
-      </w:pPr>
-      <w:r>
-        <w:t>MySQL se configura mediante MERY_DB_URL, MERY_DB_USER y MERY_DB_PASSWORD; las credenciales no se guardan en Git. Spring Data JPA realiza consultas y escrituras sobre usuarios, productos, pedidos y detalle_pedidos. database/schema.sql define tablas, claves y catálogo inicial para una base nueva. Las pruebas automáticas y la ejecución observada en este avance utilizaron H2; la conexión y el flujo completo con MySQL 8 deben repetirse en el equipo de entrega antes de declarar esa integración verificada.</w:t>
+        <w:keepLines/>
+        <w:spacing w:line="276" w:lineRule="auto" w:after="140"/>
+        <w:jc w:val="both"/>
+      </w:pPr>
+      <w:r>
+        <w:t>Spring Data JPA se utiliza para leer y guardar usuarios, productos, pedidos y detalles. El archivo database/schema.sql define las tablas, sus relaciones y un catálogo inicial para crear una base MySQL nueva. La conexión se configura con MERY_DB_URL, MERY_DB_USER y MERY_DB_PASSWORD, de modo que cada integrante pueda usar sus propias credenciales locales sin publicarlas en GitHub.</w:t>
+      </w:r>
+    </w:p>
+    <w:p>
+      <w:pPr>
+        <w:keepLines/>
+        <w:spacing w:line="276" w:lineRule="auto" w:after="140"/>
+        <w:jc w:val="both"/>
+      </w:pPr>
+      <w:r>
+        <w:t>En esta etapa comprobamos las operaciones principales con H2 en memoria: registrar un cliente, consultar productos, guardar un pedido con sus detalles y actualizar existencias. H2 permitió ejecutar las pruebas sin depender de una instalación MySQL durante la revisión. La integración definitiva con MySQL 8, incluida la comprobación del esquema y los datos después de reiniciar el servidor, queda pendiente para la validación en el equipo de entrega.</w:t>
       </w:r>
     </w:p>
     <w:p>
       <w:pPr>
         <w:pStyle w:val="Heading4"/>
-        <w:numPr>
-          <w:ilvl w:val="1"/>
-          <w:numId w:val="6"/>
-        </w:numPr>
-        <w:tabs>
-          <w:tab w:pos="460" w:val="left" w:leader="none"/>
-        </w:tabs>
-        <w:spacing w:line="240" w:lineRule="auto" w:before="236" w:after="0"/>
-        <w:ind w:left="460" w:right="0" w:hanging="460"/>
-        <w:jc w:val="left"/>
+        <w:keepNext/>
+        <w:spacing w:before="240" w:after="100"/>
       </w:pPr>
       <w:r>
         <w:t>5.6. Configuración de infraestructura y plataforma</w:t>
@@ -9160,118 +9115,29 @@
     </w:p>
     <w:p>
       <w:pPr>
-        <w:pStyle w:val="ListParagraph"/>
-        <w:numPr>
-          <w:ilvl w:val="2"/>
-          <w:numId w:val="6"/>
-        </w:numPr>
-        <w:tabs>
-          <w:tab w:pos="360" w:val="left" w:leader="none"/>
-        </w:tabs>
-        <w:spacing w:line="240" w:lineRule="auto" w:before="50" w:after="0"/>
-        <w:ind w:left="360" w:right="0" w:hanging="360"/>
-        <w:jc w:val="left"/>
-        <w:rPr>
-          <w:sz w:val="22"/>
-        </w:rPr>
-      </w:pPr>
-      <w:r>
-        <w:t>Servidor. Spring Boot atiende la API en localhost:8080. Un servidor HTTP estático atiende el frontend en localhost:3000 o 5500. CORS permite esos orígenes locales configurables por MERY_FRONTEND_ORIGINS.</w:t>
-      </w:r>
-    </w:p>
-    <w:p>
-      <w:pPr>
-        <w:pStyle w:val="ListParagraph"/>
-        <w:numPr>
-          <w:ilvl w:val="2"/>
-          <w:numId w:val="6"/>
-        </w:numPr>
-        <w:tabs>
-          <w:tab w:pos="360" w:val="left" w:leader="none"/>
-        </w:tabs>
-        <w:spacing w:line="240" w:lineRule="auto" w:before="36" w:after="0"/>
-        <w:ind w:left="360" w:right="0" w:hanging="360"/>
-        <w:jc w:val="left"/>
-        <w:rPr>
-          <w:sz w:val="22"/>
-        </w:rPr>
-      </w:pPr>
-      <w:r>
-        <w:t>Máquina virtual o contenedor. Este avance no requiere VM ni contenedor. Se ejecuta directamente en el equipo local con JDK 21 y MySQL 8; el perfil de pruebas utiliza H2 temporal.</w:t>
-      </w:r>
-    </w:p>
-    <w:p>
-      <w:pPr>
-        <w:pStyle w:val="ListParagraph"/>
-        <w:numPr>
-          <w:ilvl w:val="2"/>
-          <w:numId w:val="6"/>
-        </w:numPr>
-        <w:tabs>
-          <w:tab w:pos="360" w:val="left" w:leader="none"/>
-        </w:tabs>
-        <w:spacing w:line="240" w:lineRule="auto" w:before="35" w:after="0"/>
-        <w:ind w:left="360" w:right="0" w:hanging="360"/>
-        <w:jc w:val="left"/>
-        <w:rPr>
-          <w:sz w:val="22"/>
-        </w:rPr>
-      </w:pPr>
-      <w:r>
-        <w:t>Cloud. No hay despliegue en la nube ni dominio público; GitHub aloja el código y la documentación, no la aplicación en ejecución.</w:t>
-      </w:r>
-    </w:p>
-    <w:p>
-      <w:pPr>
-        <w:pStyle w:val="ListParagraph"/>
-        <w:spacing w:after="0" w:line="240" w:lineRule="auto"/>
-        <w:jc w:val="left"/>
-        <w:rPr>
-          <w:sz w:val="22"/>
-        </w:rPr>
-        <w:sectPr>
-          <w:pgSz w:w="12240" w:h="15840"/>
-          <w:pgMar w:top="1360" w:bottom="280" w:left="1440" w:right="1080"/>
-        </w:sectPr>
-      </w:pPr>
-      <w:r>
-        <w:t>Configuración segura. MERY_JWT_SECRET se define fuera del repositorio. Las cuentas locales de administrador y repartidor pueden crearse con MERY_SEED_DEMO=true y contraseñas definidas por el operador. El README explica la preparación de la base y el arranque por sistema operativo.</w:t>
-      </w:r>
-    </w:p>
-    <w:p>
-      <w:pPr>
-        <w:pStyle w:val="ListParagraph"/>
-        <w:numPr>
-          <w:ilvl w:val="2"/>
-          <w:numId w:val="6"/>
-        </w:numPr>
-        <w:tabs>
-          <w:tab w:pos="360" w:val="left" w:leader="none"/>
-        </w:tabs>
-        <w:spacing w:line="240" w:lineRule="auto" w:before="81" w:after="0"/>
-        <w:ind w:left="360" w:right="0" w:hanging="360"/>
-        <w:jc w:val="left"/>
-        <w:rPr>
-          <w:sz w:val="22"/>
-        </w:rPr>
-      </w:pPr>
-      <w:r>
-        <w:t>Reproducción. Se clona la rama desarrollador/GDvega, se prepara una base MySQL nueva con database/schema.sql, se configuran variables de entorno, se ejecuta backend/mvnw spring-boot:run y se sirve frontend/. Para repetir las pruebas automatizadas se usa backend/mvnw test y node frontend/tests/check.cjs.</w:t>
+        <w:keepLines/>
+        <w:spacing w:line="276" w:lineRule="auto" w:after="140"/>
+        <w:jc w:val="both"/>
+      </w:pPr>
+      <w:r>
+        <w:t>Por ahora la aplicación corre de forma local. Spring Boot atiende la API en localhost:8080 y el frontend se sirve por HTTP en localhost:3000 o 5500. Los orígenes permitidos se configuran para esos puertos. No se utilizó una máquina virtual, un contenedor ni una plataforma cloud; GitHub se emplea para almacenar y compartir el proyecto, no para alojar la aplicación ejecutándose.</w:t>
+      </w:r>
+    </w:p>
+    <w:p>
+      <w:pPr>
+        <w:keepLines/>
+        <w:spacing w:line="276" w:lineRule="auto" w:after="140"/>
+        <w:jc w:val="both"/>
+      </w:pPr>
+      <w:r>
+        <w:t>Para reproducir el entorno, se clona la rama desarrollador/GDvega, se prepara una base MySQL nueva con el script de database/, se configuran las variables de entorno y se inicia el backend con mvnw spring-boot:run. Después se sirve la carpeta frontend/ desde un servidor HTTP local. El README explica esta secuencia y el perfil H2, que sirve para probar sin MySQL y no conserva datos al apagar el servidor.</w:t>
       </w:r>
     </w:p>
     <w:p>
       <w:pPr>
         <w:pStyle w:val="Heading4"/>
-        <w:numPr>
-          <w:ilvl w:val="1"/>
-          <w:numId w:val="6"/>
-        </w:numPr>
-        <w:tabs>
-          <w:tab w:pos="460" w:val="left" w:leader="none"/>
-        </w:tabs>
-        <w:spacing w:line="240" w:lineRule="auto" w:before="236" w:after="0"/>
-        <w:ind w:left="460" w:right="0" w:hanging="460"/>
-        <w:jc w:val="left"/>
+        <w:keepNext/>
+        <w:spacing w:before="240" w:after="100"/>
       </w:pPr>
       <w:r>
         <w:t>5.7. Evidencias de implementación</w:t>
@@ -9279,23 +9145,22 @@
     </w:p>
     <w:p>
       <w:pPr>
-        <w:pStyle w:val="ListParagraph"/>
-        <w:numPr>
-          <w:ilvl w:val="2"/>
-          <w:numId w:val="6"/>
-        </w:numPr>
-        <w:tabs>
-          <w:tab w:pos="360" w:val="left" w:leader="none"/>
-        </w:tabs>
-        <w:spacing w:line="271" w:lineRule="auto" w:before="47" w:after="0"/>
-        <w:ind w:left="360" w:right="1080" w:hanging="360"/>
-        <w:jc w:val="left"/>
-        <w:rPr>
-          <w:sz w:val="22"/>
-        </w:rPr>
-      </w:pPr>
-      <w:r>
-        <w:t>Evidencia verificable en el repositorio: (1) backend/src/test/java/com/merysalud/ApiFlowTests.java prueba credenciales, rol, catálogo, pedido, stock y reparto con H2; (2) frontend/tests/check.cjs comprueba reglas de interfaz; (3) docs/evidencias/medicion_catalogo_h2.json registra 30 consultas a GET /api/productos en entorno local H2, cuatro productos, mediana 3,42 ms, máximo 6,23 ms y criterio de 3 s; (4) el código de seguridad, controladores, servicios y database/schema.sql muestra la implementación. La interfaz se observó localmente en Firefox. Las capturas persistentes del IDE, repositorio en GitHub, MySQL y flujos de pantalla aún deben anexarse tras reproducir el sistema en el equipo de entrega; no se presentan imágenes generadas con IA como prueba.</w:t>
+        <w:keepLines/>
+        <w:spacing w:line="276" w:lineRule="auto" w:after="140"/>
+        <w:jc w:val="both"/>
+      </w:pPr>
+      <w:r>
+        <w:t>Las figuras anteriores se obtuvieron de pantallas funcionando y de la rama publicada en GitHub; no se usaron imágenes generadas con IA como evidencia. Además, ApiFlowTests.java contiene tres pruebas del flujo de la API y la prueba de arranque del backend completa el conjunto de cuatro pruebas JUnit ejecutadas sin fallos. El archivo frontend/tests/check.cjs pasó sus comprobaciones de totales, formularios, almacenamiento y referencias HTML.</w:t>
+      </w:r>
+    </w:p>
+    <w:p>
+      <w:pPr>
+        <w:keepLines/>
+        <w:spacing w:line="276" w:lineRule="auto" w:after="140"/>
+        <w:jc w:val="both"/>
+      </w:pPr>
+      <w:r>
+        <w:t>La medición registrada en docs/evidencias/medicion_catalogo_h2.json tomó 30 respuestas de GET /api/productos con cuatro productos: mediana de 3,42 ms y máximo de 6,23 ms frente al criterio de 3 segundos. Este dato describe solo el entorno H2 local. Para cerrar la evidencia del informe aún se necesitan capturas del IDE usado por el equipo y de MySQL ejecutándose en el equipo de entrega, además de repetir allí las pruebas de rendimiento y el flujo completo.</w:t>
       </w:r>
     </w:p>
     <w:p>

</xml_diff>

<commit_message>
Documentar entorno local y agregar figuras al capítulo V
</commit_message>
<xml_diff>
--- a/docs/Informe_Integrador_II_Capitulo_V.docx
+++ b/docs/Informe_Integrador_II_Capitulo_V.docx
@@ -8690,7 +8690,7 @@
         <w:jc w:val="both"/>
       </w:pPr>
       <w:r>
-        <w:t>La verificación de este avance se realizó en Ubuntu 26.04.1 LTS con el frontend y el backend levantados en la misma computadora. Para las pruebas automáticas y las capturas de las pantallas se utilizó H2 en memoria. MySQL 8 es la base prevista para la entrega local del proyecto, pero todavía falta repetir el recorrido completo con una instancia MySQL del equipo. Git, GitHub, un servidor HTTP local y el navegador completaron las herramientas de trabajo.</w:t>
+        <w:t>La verificación de este avance se realizó en Ubuntu 26.04.1 LTS con el frontend y el backend en la misma computadora. Las pruebas automáticas y las primeras capturas se hicieron con H2 en memoria. MySQL 8.4 y DBeaver ya están instalados en el equipo, pero aún falta configurar el usuario de la aplicación y repetir el recorrido completo con esa base. Git, GitHub, Visual Studio Code, un servidor HTTP local y el navegador completaron las herramientas de trabajo.</w:t>
       </w:r>
     </w:p>
     <w:p>
@@ -9100,7 +9100,61 @@
         <w:jc w:val="both"/>
       </w:pPr>
       <w:r>
-        <w:t>En esta etapa comprobamos las operaciones principales con H2 en memoria: registrar un cliente, consultar productos, guardar un pedido con sus detalles y actualizar existencias. H2 permitió ejecutar las pruebas sin depender de una instalación MySQL durante la revisión. La integración definitiva con MySQL 8, incluida la comprobación del esquema y los datos después de reiniciar el servidor, queda pendiente para la validación en el equipo de entrega.</w:t>
+        <w:t>En esta etapa comprobamos las operaciones principales con H2 en memoria: registrar un cliente, consultar productos, guardar un pedido con sus detalles y actualizar existencias. MySQL 8.4 está instalado y el servicio se encuentra activo, pero todavía no se ha comprobado la conexión de la API ni la persistencia después de reiniciarla. La figura 5.6 muestra las tablas que intervienen en el pedido; es un esquema elaborado a partir de database/schema.sql, no una captura de una base MySQL funcionando.</w:t>
+      </w:r>
+    </w:p>
+    <w:p>
+      <w:pPr>
+        <w:keepNext/>
+        <w:spacing w:before="160" w:after="60"/>
+        <w:jc w:val="center"/>
+      </w:pPr>
+      <w:r>
+        <w:drawing>
+          <wp:inline>
+            <wp:extent cx="5394960" cy="2562606"/>
+            <wp:docPr id="6" name="Picture 6"/>
+            <wp:cNvGraphicFramePr>
+              <a:graphicFrameLocks noChangeAspect="1"/>
+            </wp:cNvGraphicFramePr>
+            <a:graphic>
+              <a:graphicData uri="http://schemas.openxmlformats.org/drawingml/2006/picture">
+                <pic:pic>
+                  <pic:nvPicPr>
+                    <pic:cNvPr id="0" name="07_modelo_datos.png"/>
+                    <pic:cNvPicPr/>
+                  </pic:nvPicPr>
+                  <pic:blipFill>
+                    <a:blip r:embed="rId11"/>
+                    <a:stretch>
+                      <a:fillRect/>
+                    </a:stretch>
+                  </pic:blipFill>
+                  <pic:spPr>
+                    <a:xfrm>
+                      <a:off x="0" y="0"/>
+                      <a:ext cx="5394960" cy="2562606"/>
+                    </a:xfrm>
+                    <a:prstGeom prst="rect"/>
+                  </pic:spPr>
+                </pic:pic>
+              </a:graphicData>
+            </a:graphic>
+          </wp:inline>
+        </w:drawing>
+      </w:r>
+    </w:p>
+    <w:p>
+      <w:pPr>
+        <w:spacing w:after="240"/>
+        <w:jc w:val="center"/>
+      </w:pPr>
+      <w:r>
+        <w:rPr>
+          <w:i/>
+          <w:sz w:val="18"/>
+        </w:rPr>
+        <w:t>Figura 5.6. Tablas relacionadas con el pedido. Fuente: elaboración propia a partir de database/schema.sql.</w:t>
       </w:r>
     </w:p>
     <w:p>
@@ -9120,7 +9174,7 @@
         <w:jc w:val="both"/>
       </w:pPr>
       <w:r>
-        <w:t>Por ahora la aplicación corre de forma local. Spring Boot atiende la API en localhost:8080 y el frontend se sirve por HTTP en localhost:3000 o 5500. Los orígenes permitidos se configuran para esos puertos. No se utilizó una máquina virtual, un contenedor ni una plataforma cloud; GitHub se emplea para almacenar y compartir el proyecto, no para alojar la aplicación ejecutándose.</w:t>
+        <w:t>Por ahora la aplicación corre de forma local. Spring Boot atiende la API en localhost:8080 y el frontend se sirve por HTTP en localhost:3000 o 5500. MySQL está instalado en el mismo equipo y se prevé su conexión por localhost:3306. La figura 5.7 representa esa configuración. No utilizamos máquina virtual, contenedor ni plataforma cloud; GitHub almacena el proyecto, pero no aloja la aplicación en ejecución.</w:t>
       </w:r>
     </w:p>
     <w:p>
@@ -9135,6 +9189,60 @@
     </w:p>
     <w:p>
       <w:pPr>
+        <w:keepNext/>
+        <w:spacing w:before="160" w:after="60"/>
+        <w:jc w:val="center"/>
+      </w:pPr>
+      <w:r>
+        <w:drawing>
+          <wp:inline>
+            <wp:extent cx="5394960" cy="2562606"/>
+            <wp:docPr id="7" name="Picture 7"/>
+            <wp:cNvGraphicFramePr>
+              <a:graphicFrameLocks noChangeAspect="1"/>
+            </wp:cNvGraphicFramePr>
+            <a:graphic>
+              <a:graphicData uri="http://schemas.openxmlformats.org/drawingml/2006/picture">
+                <pic:pic>
+                  <pic:nvPicPr>
+                    <pic:cNvPr id="0" name="08_entorno_local.png"/>
+                    <pic:cNvPicPr/>
+                  </pic:nvPicPr>
+                  <pic:blipFill>
+                    <a:blip r:embed="rId12"/>
+                    <a:stretch>
+                      <a:fillRect/>
+                    </a:stretch>
+                  </pic:blipFill>
+                  <pic:spPr>
+                    <a:xfrm>
+                      <a:off x="0" y="0"/>
+                      <a:ext cx="5394960" cy="2562606"/>
+                    </a:xfrm>
+                    <a:prstGeom prst="rect"/>
+                  </pic:spPr>
+                </pic:pic>
+              </a:graphicData>
+            </a:graphic>
+          </wp:inline>
+        </w:drawing>
+      </w:r>
+    </w:p>
+    <w:p>
+      <w:pPr>
+        <w:spacing w:after="240"/>
+        <w:jc w:val="center"/>
+      </w:pPr>
+      <w:r>
+        <w:rPr>
+          <w:i/>
+          <w:sz w:val="18"/>
+        </w:rPr>
+        <w:t>Figura 5.7. Configuración local prevista para frontend, API y MySQL. Fuente: elaboración propia a partir del código.</w:t>
+      </w:r>
+    </w:p>
+    <w:p>
+      <w:pPr>
         <w:pStyle w:val="Heading4"/>
         <w:keepNext/>
         <w:spacing w:before="240" w:after="100"/>
@@ -9150,7 +9258,7 @@
         <w:jc w:val="both"/>
       </w:pPr>
       <w:r>
-        <w:t>Las figuras anteriores se obtuvieron de pantallas funcionando y de la rama publicada en GitHub; no se usaron imágenes generadas con IA como evidencia. Además, ApiFlowTests.java contiene tres pruebas del flujo de la API y la prueba de arranque del backend completa el conjunto de cuatro pruebas JUnit ejecutadas sin fallos. El archivo frontend/tests/check.cjs pasó sus comprobaciones de totales, formularios, almacenamiento y referencias HTML.</w:t>
+        <w:t>Las figuras 5.1 a 5.5 y 5.8 se obtuvieron del repositorio y de pantallas funcionando en el equipo local; no se usaron imágenes generadas con IA como evidencia. Las figuras 5.6 y 5.7 son diagramas elaborados a partir del código y se distinguen de las capturas reales. La figura 5.8 muestra el formulario de acceso servido desde localhost. Las pruebas JUnit del backend y las comprobaciones del frontend finalizaron sin fallos.</w:t>
       </w:r>
     </w:p>
     <w:p>
@@ -9161,6 +9269,60 @@
       </w:pPr>
       <w:r>
         <w:t>La medición registrada en docs/evidencias/medicion_catalogo_h2.json tomó 30 respuestas de GET /api/productos con cuatro productos: mediana de 3,42 ms y máximo de 6,23 ms frente al criterio de 3 segundos. Este dato describe solo el entorno H2 local. Para cerrar la evidencia del informe aún se necesitan capturas del IDE usado por el equipo y de MySQL ejecutándose en el equipo de entrega, además de repetir allí las pruebas de rendimiento y el flujo completo.</w:t>
+      </w:r>
+    </w:p>
+    <w:p>
+      <w:pPr>
+        <w:keepNext/>
+        <w:spacing w:before="160" w:after="60"/>
+        <w:jc w:val="center"/>
+      </w:pPr>
+      <w:r>
+        <w:drawing>
+          <wp:inline>
+            <wp:extent cx="5394960" cy="3080577"/>
+            <wp:docPr id="8" name="Picture 8"/>
+            <wp:cNvGraphicFramePr>
+              <a:graphicFrameLocks noChangeAspect="1"/>
+            </wp:cNvGraphicFramePr>
+            <a:graphic>
+              <a:graphicData uri="http://schemas.openxmlformats.org/drawingml/2006/picture">
+                <pic:pic>
+                  <pic:nvPicPr>
+                    <pic:cNvPr id="0" name="03_acceso_local.png"/>
+                    <pic:cNvPicPr/>
+                  </pic:nvPicPr>
+                  <pic:blipFill>
+                    <a:blip r:embed="rId13"/>
+                    <a:stretch>
+                      <a:fillRect/>
+                    </a:stretch>
+                  </pic:blipFill>
+                  <pic:spPr>
+                    <a:xfrm>
+                      <a:off x="0" y="0"/>
+                      <a:ext cx="5394960" cy="3080577"/>
+                    </a:xfrm>
+                    <a:prstGeom prst="rect"/>
+                  </pic:spPr>
+                </pic:pic>
+              </a:graphicData>
+            </a:graphic>
+          </wp:inline>
+        </w:drawing>
+      </w:r>
+    </w:p>
+    <w:p>
+      <w:pPr>
+        <w:spacing w:after="240"/>
+        <w:jc w:val="center"/>
+      </w:pPr>
+      <w:r>
+        <w:rPr>
+          <w:i/>
+          <w:sz w:val="18"/>
+        </w:rPr>
+        <w:t>Figura 5.8. Formulario de acceso servido en localhost. Fuente: captura propia con el perfil H2, 03/10/2026.</w:t>
       </w:r>
     </w:p>
     <w:p>

</xml_diff>

<commit_message>
Verificar MySQL local y cerrar evidencias del capítulo V
</commit_message>
<xml_diff>
--- a/docs/Informe_Integrador_II_Capitulo_V.docx
+++ b/docs/Informe_Integrador_II_Capitulo_V.docx
@@ -8690,7 +8690,7 @@
         <w:jc w:val="both"/>
       </w:pPr>
       <w:r>
-        <w:t>La verificación de este avance se realizó en Ubuntu 26.04.1 LTS con el frontend y el backend en la misma computadora. Las pruebas automáticas y las primeras capturas se hicieron con H2 en memoria. MySQL 8.4 y DBeaver ya están instalados en el equipo, pero aún falta configurar el usuario de la aplicación y repetir el recorrido completo con esa base. Git, GitHub, Visual Studio Code, un servidor HTTP local y el navegador completaron las herramientas de trabajo.</w:t>
+        <w:t>La verificación de este avance se realizó en Ubuntu 26.04.1 LTS con el frontend y el backend en la misma computadora. Primero usamos H2 en memoria para las pruebas automáticas y las capturas iniciales. Después configuramos MySQL 8.4 local y repetimos un pedido real contra esa base. Visual Studio Code, Git, GitHub, DBeaver, un servidor HTTP local y el navegador completaron las herramientas de trabajo.</w:t>
       </w:r>
     </w:p>
     <w:p>
@@ -9100,7 +9100,7 @@
         <w:jc w:val="both"/>
       </w:pPr>
       <w:r>
-        <w:t>En esta etapa comprobamos las operaciones principales con H2 en memoria: registrar un cliente, consultar productos, guardar un pedido con sus detalles y actualizar existencias. MySQL 8.4 está instalado y el servicio se encuentra activo, pero todavía no se ha comprobado la conexión de la API ni la persistencia después de reiniciarla. La figura 5.6 muestra las tablas que intervienen en el pedido; es un esquema elaborado a partir de database/schema.sql, no una captura de una base MySQL funcionando.</w:t>
+        <w:t>Además de las pruebas con H2, comprobamos la integración con MySQL 8.4 instalado en este equipo. La base merysalud_db tiene 6 tablas y la API devolvió 20 productos. Registramos un cliente de prueba y el pedido ORD-5F0CF7B3-FF0; MySQL guardó su cabecera y 1 detalle. El stock del producto 1 bajó de 24 a 23 unidades y el pedido apareció en el historial del cliente. Luego reiniciamos la API y comprobamos que el pedido y el stock seguían en MySQL. La figura 5.6 resume las relaciones principales y la figura 5.7 presenta los datos de la comprobación.</w:t>
       </w:r>
     </w:p>
     <w:p>
@@ -9154,37 +9154,7 @@
           <w:i/>
           <w:sz w:val="18"/>
         </w:rPr>
-        <w:t>Figura 5.6. Tablas relacionadas con el pedido. Fuente: elaboración propia a partir de database/schema.sql.</w:t>
-      </w:r>
-    </w:p>
-    <w:p>
-      <w:pPr>
-        <w:pStyle w:val="Heading4"/>
-        <w:keepNext/>
-        <w:spacing w:before="240" w:after="100"/>
-      </w:pPr>
-      <w:r>
-        <w:t>5.6. Configuración de infraestructura y plataforma</w:t>
-      </w:r>
-    </w:p>
-    <w:p>
-      <w:pPr>
-        <w:keepLines/>
-        <w:spacing w:line="276" w:lineRule="auto" w:after="140"/>
-        <w:jc w:val="both"/>
-      </w:pPr>
-      <w:r>
-        <w:t>Por ahora la aplicación corre de forma local. Spring Boot atiende la API en localhost:8080 y el frontend se sirve por HTTP en localhost:3000 o 5500. MySQL está instalado en el mismo equipo y se prevé su conexión por localhost:3306. La figura 5.7 representa esa configuración. No utilizamos máquina virtual, contenedor ni plataforma cloud; GitHub almacena el proyecto, pero no aloja la aplicación en ejecución.</w:t>
-      </w:r>
-    </w:p>
-    <w:p>
-      <w:pPr>
-        <w:keepLines/>
-        <w:spacing w:line="276" w:lineRule="auto" w:after="140"/>
-        <w:jc w:val="both"/>
-      </w:pPr>
-      <w:r>
-        <w:t>Para reproducir el entorno, se clona la rama desarrollador/GDvega, se prepara una base MySQL nueva con el script de database/, se configuran las variables de entorno y se inicia el backend con mvnw spring-boot:run. Después se sirve la carpeta frontend/ desde un servidor HTTP local. El README explica esta secuencia y el perfil H2, que sirve para probar sin MySQL y no conserva datos al apagar el servidor.</w:t>
+        <w:t>Figura 5.6. Relación entre usuarios, pedidos, detalles y productos. Fuente: elaboración propia a partir de database/schema.sql.</w:t>
       </w:r>
     </w:p>
     <w:p>
@@ -9205,7 +9175,7 @@
               <a:graphicData uri="http://schemas.openxmlformats.org/drawingml/2006/picture">
                 <pic:pic>
                   <pic:nvPicPr>
-                    <pic:cNvPr id="0" name="08_entorno_local.png"/>
+                    <pic:cNvPr id="0" name="09_mysql_verificado.png"/>
                     <pic:cNvPicPr/>
                   </pic:nvPicPr>
                   <pic:blipFill>
@@ -9238,7 +9208,7 @@
           <w:i/>
           <w:sz w:val="18"/>
         </w:rPr>
-        <w:t>Figura 5.7. Configuración local prevista para frontend, API y MySQL. Fuente: elaboración propia a partir del código.</w:t>
+        <w:t>Figura 5.7. Resultados del pedido de prueba persistido en MySQL local. Fuente: consultas SQL y API, 04/10/2026.</w:t>
       </w:r>
     </w:p>
     <w:p>
@@ -9248,7 +9218,7 @@
         <w:spacing w:before="240" w:after="100"/>
       </w:pPr>
       <w:r>
-        <w:t>5.7. Evidencias de implementación</w:t>
+        <w:t>5.6. Configuración de infraestructura y plataforma</w:t>
       </w:r>
     </w:p>
     <w:p>
@@ -9258,7 +9228,7 @@
         <w:jc w:val="both"/>
       </w:pPr>
       <w:r>
-        <w:t>Las figuras 5.1 a 5.5 y 5.8 se obtuvieron del repositorio y de pantallas funcionando en el equipo local; no se usaron imágenes generadas con IA como evidencia. Las figuras 5.6 y 5.7 son diagramas elaborados a partir del código y se distinguen de las capturas reales. La figura 5.8 muestra el formulario de acceso servido desde localhost. Las pruebas JUnit del backend y las comprobaciones del frontend finalizaron sin fallos.</w:t>
+        <w:t>Por ahora la aplicación corre de forma local. Spring Boot atiende la API en localhost:8080, el frontend se sirve por HTTP en localhost:3000 y MySQL escucha en localhost:3306. DBeaver está instalado para revisar la base de datos desde una interfaz gráfica. No utilizamos una máquina virtual, contenedor ni plataforma cloud; GitHub conserva el código y el informe, pero no aloja la aplicación en ejecución. La figura 5.8 muestra cómo se conectan los tres componentes.</w:t>
       </w:r>
     </w:p>
     <w:p>
@@ -9268,7 +9238,7 @@
         <w:jc w:val="both"/>
       </w:pPr>
       <w:r>
-        <w:t>La medición registrada en docs/evidencias/medicion_catalogo_h2.json tomó 30 respuestas de GET /api/productos con cuatro productos: mediana de 3,42 ms y máximo de 6,23 ms frente al criterio de 3 segundos. Este dato describe solo el entorno H2 local. Para cerrar la evidencia del informe aún se necesitan capturas del IDE usado por el equipo y de MySQL ejecutándose en el equipo de entrega, además de repetir allí las pruebas de rendimiento y el flujo completo.</w:t>
+        <w:t>Para reproducir el entorno en Ubuntu se clona la rama desarrollador/GDvega y se ejecuta scripts/setup-local-ubuntu.sh con sudo. El script instala Java 21, carga database/schema.sql y crea un usuario MySQL limitado a la base del proyecto. Las claves locales se guardan en .env, archivo ignorado por Git. Después se cargan esas variables y se inicia el backend con mvnw spring-boot:run; el frontend se sirve desde frontend/. El README también explica cómo hacer estos pasos de forma manual.</w:t>
       </w:r>
     </w:p>
     <w:p>
@@ -9280,8 +9250,92 @@
       <w:r>
         <w:drawing>
           <wp:inline>
+            <wp:extent cx="5394960" cy="2562606"/>
+            <wp:docPr id="8" name="Picture 8"/>
+            <wp:cNvGraphicFramePr>
+              <a:graphicFrameLocks noChangeAspect="1"/>
+            </wp:cNvGraphicFramePr>
+            <a:graphic>
+              <a:graphicData uri="http://schemas.openxmlformats.org/drawingml/2006/picture">
+                <pic:pic>
+                  <pic:nvPicPr>
+                    <pic:cNvPr id="0" name="08_entorno_local.png"/>
+                    <pic:cNvPicPr/>
+                  </pic:nvPicPr>
+                  <pic:blipFill>
+                    <a:blip r:embed="rId13"/>
+                    <a:stretch>
+                      <a:fillRect/>
+                    </a:stretch>
+                  </pic:blipFill>
+                  <pic:spPr>
+                    <a:xfrm>
+                      <a:off x="0" y="0"/>
+                      <a:ext cx="5394960" cy="2562606"/>
+                    </a:xfrm>
+                    <a:prstGeom prst="rect"/>
+                  </pic:spPr>
+                </pic:pic>
+              </a:graphicData>
+            </a:graphic>
+          </wp:inline>
+        </w:drawing>
+      </w:r>
+    </w:p>
+    <w:p>
+      <w:pPr>
+        <w:spacing w:after="240"/>
+        <w:jc w:val="center"/>
+      </w:pPr>
+      <w:r>
+        <w:rPr>
+          <w:i/>
+          <w:sz w:val="18"/>
+        </w:rPr>
+        <w:t>Figura 5.8. Entorno de ejecución local y comunicación entre componentes. Fuente: elaboración propia a partir del código.</w:t>
+      </w:r>
+    </w:p>
+    <w:p>
+      <w:pPr>
+        <w:pStyle w:val="Heading4"/>
+        <w:keepNext/>
+        <w:spacing w:before="240" w:after="100"/>
+      </w:pPr>
+      <w:r>
+        <w:t>5.7. Evidencias de implementación</w:t>
+      </w:r>
+    </w:p>
+    <w:p>
+      <w:pPr>
+        <w:keepLines/>
+        <w:spacing w:line="276" w:lineRule="auto" w:after="140"/>
+        <w:jc w:val="both"/>
+      </w:pPr>
+      <w:r>
+        <w:t>Las capturas del catálogo, búsqueda, acceso, administración e historial se obtuvieron de la aplicación funcionando en el equipo local. Las figuras 5.6 y 5.8 son diagramas elaborados a partir del esquema SQL y de la configuración del repositorio; las figuras 5.7 y 5.10 resumen resultados observados en MySQL y en las pruebas. No se presentan imágenes generadas con IA como prueba de funcionamiento. La figura 5.9 muestra el formulario de acceso que usamos durante la revisión.</w:t>
+      </w:r>
+    </w:p>
+    <w:p>
+      <w:pPr>
+        <w:keepLines/>
+        <w:spacing w:line="276" w:lineRule="auto" w:after="140"/>
+        <w:jc w:val="both"/>
+      </w:pPr>
+      <w:r>
+        <w:t>Las pruebas JUnit del backend terminaron sin fallos y las comprobaciones del frontend también pasaron. En H2, 30 consultas de GET /api/productos con cuatro productos tuvieron una mediana de 3,42 ms y un máximo de 6,23 ms. Repetimos la medición con MySQL y el catálogo cargado: 30 consultas, mediana de 3,81 ms y máximo de 6,44 ms. Estas cifras corresponden a una sola computadora en red local; no representan el comportamiento de un servidor publicado ni de varios usuarios simultáneos. La matriz de pruebas indica qué casos se comprobaron y qué partes del sistema siguen pendientes.</w:t>
+      </w:r>
+    </w:p>
+    <w:p>
+      <w:pPr>
+        <w:keepNext/>
+        <w:spacing w:before="160" w:after="60"/>
+        <w:jc w:val="center"/>
+      </w:pPr>
+      <w:r>
+        <w:drawing>
+          <wp:inline>
             <wp:extent cx="5394960" cy="3080577"/>
-            <wp:docPr id="8" name="Picture 8"/>
+            <wp:docPr id="9" name="Picture 9"/>
             <wp:cNvGraphicFramePr>
               <a:graphicFrameLocks noChangeAspect="1"/>
             </wp:cNvGraphicFramePr>
@@ -9293,7 +9347,7 @@
                     <pic:cNvPicPr/>
                   </pic:nvPicPr>
                   <pic:blipFill>
-                    <a:blip r:embed="rId13"/>
+                    <a:blip r:embed="rId14"/>
                     <a:stretch>
                       <a:fillRect/>
                     </a:stretch>
@@ -9322,12 +9376,67 @@
           <w:i/>
           <w:sz w:val="18"/>
         </w:rPr>
-        <w:t>Figura 5.8. Formulario de acceso servido en localhost. Fuente: captura propia con el perfil H2, 03/10/2026.</w:t>
+        <w:t>Figura 5.9. Formulario de acceso servido en localhost. Fuente: captura propia con el perfil H2, 03/10/2026.</w:t>
+      </w:r>
+    </w:p>
+    <w:p>
+      <w:pPr>
+        <w:keepNext/>
+        <w:spacing w:before="160" w:after="60"/>
+        <w:jc w:val="center"/>
+      </w:pPr>
+      <w:r>
+        <w:drawing>
+          <wp:inline>
+            <wp:extent cx="5394960" cy="2562606"/>
+            <wp:docPr id="10" name="Picture 10"/>
+            <wp:cNvGraphicFramePr>
+              <a:graphicFrameLocks noChangeAspect="1"/>
+            </wp:cNvGraphicFramePr>
+            <a:graphic>
+              <a:graphicData uri="http://schemas.openxmlformats.org/drawingml/2006/picture">
+                <pic:pic>
+                  <pic:nvPicPr>
+                    <pic:cNvPr id="0" name="10_pruebas_verificadas.png"/>
+                    <pic:cNvPicPr/>
+                  </pic:nvPicPr>
+                  <pic:blipFill>
+                    <a:blip r:embed="rId15"/>
+                    <a:stretch>
+                      <a:fillRect/>
+                    </a:stretch>
+                  </pic:blipFill>
+                  <pic:spPr>
+                    <a:xfrm>
+                      <a:off x="0" y="0"/>
+                      <a:ext cx="5394960" cy="2562606"/>
+                    </a:xfrm>
+                    <a:prstGeom prst="rect"/>
+                  </pic:spPr>
+                </pic:pic>
+              </a:graphicData>
+            </a:graphic>
+          </wp:inline>
+        </w:drawing>
+      </w:r>
+    </w:p>
+    <w:p>
+      <w:pPr>
+        <w:spacing w:after="240"/>
+        <w:jc w:val="center"/>
+      </w:pPr>
+      <w:r>
+        <w:rPr>
+          <w:i/>
+          <w:sz w:val="18"/>
+        </w:rPr>
+        <w:t>Figura 5.10. Resumen de pruebas del backend, frontend y flujo local con MySQL. Fuente: reportes y verificaciones del proyecto.</w:t>
       </w:r>
     </w:p>
     <w:p>
       <w:pPr>
         <w:pStyle w:val="Heading3"/>
+        <w:pageBreakBefore/>
         <w:spacing w:before="207"/>
       </w:pPr>
       <w:r>

</xml_diff>

<commit_message>
Mostrar las seis tablas en el modelo relacional
</commit_message>
<xml_diff>
--- a/docs/Informe_Integrador_II_Capitulo_V.docx
+++ b/docs/Informe_Integrador_II_Capitulo_V.docx
@@ -9100,7 +9100,7 @@
         <w:jc w:val="both"/>
       </w:pPr>
       <w:r>
-        <w:t>Además de las pruebas con H2, comprobamos la integración con MySQL 8.4 instalado en este equipo. La base merysalud_db tiene 6 tablas y la API devolvió 20 productos. Registramos un cliente de prueba y el pedido ORD-5F0CF7B3-FF0; MySQL guardó su cabecera y 1 detalle. El stock del producto 1 bajó de 24 a 23 unidades y el pedido apareció en el historial del cliente. Luego reiniciamos la API y comprobamos que el pedido y el stock seguían en MySQL. La figura 5.6 resume las relaciones principales y la figura 5.7 presenta los datos de la comprobación.</w:t>
+        <w:t>Además de las pruebas con H2, comprobamos la integración con MySQL 8.4 instalado en este equipo. La base merysalud_db tiene 6 tablas y la API devolvió 20 productos. Registramos un cliente de prueba y el pedido ORD-5F0CF7B3-FF0; MySQL guardó su cabecera y 1 detalle. El stock del producto 1 bajó de 24 a 23 unidades y el pedido apareció en el historial del cliente. Luego reiniciamos la API y comprobamos que el pedido y el stock seguían en MySQL. La figura 5.6 muestra las seis tablas y las seis claves foráneas definidas en el esquema; la figura 5.7 presenta los datos de la comprobación.</w:t>
       </w:r>
     </w:p>
     <w:p>
@@ -9112,8 +9112,8 @@
       <w:r>
         <w:drawing>
           <wp:inline>
-            <wp:extent cx="5394960" cy="2562606"/>
-            <wp:docPr id="6" name="Picture 6"/>
+            <wp:extent cx="5394960" cy="3304413"/>
+            <wp:docPr id="11" name="Picture 11"/>
             <wp:cNvGraphicFramePr>
               <a:graphicFrameLocks noChangeAspect="1"/>
             </wp:cNvGraphicFramePr>
@@ -9121,11 +9121,11 @@
               <a:graphicData uri="http://schemas.openxmlformats.org/drawingml/2006/picture">
                 <pic:pic>
                   <pic:nvPicPr>
-                    <pic:cNvPr id="0" name="07_modelo_datos.png"/>
+                    <pic:cNvPr id="0" name="image.png"/>
                     <pic:cNvPicPr/>
                   </pic:nvPicPr>
                   <pic:blipFill>
-                    <a:blip r:embed="rId11"/>
+                    <a:blip r:embed="rId17"/>
                     <a:stretch>
                       <a:fillRect/>
                     </a:stretch>
@@ -9133,7 +9133,7 @@
                   <pic:spPr>
                     <a:xfrm>
                       <a:off x="0" y="0"/>
-                      <a:ext cx="5394960" cy="2562606"/>
+                      <a:ext cx="5394960" cy="3304413"/>
                     </a:xfrm>
                     <a:prstGeom prst="rect"/>
                   </pic:spPr>
@@ -9154,7 +9154,7 @@
           <w:i/>
           <w:sz w:val="18"/>
         </w:rPr>
-        <w:t>Figura 5.6. Relación entre usuarios, pedidos, detalles y productos. Fuente: elaboración propia a partir de database/schema.sql.</w:t>
+        <w:t>Figura 5.6. Modelo relacional de las seis tablas de merysalud_db. Fuente: elaboración propia a partir de database/schema.sql.</w:t>
       </w:r>
     </w:p>
     <w:p>
@@ -9388,8 +9388,8 @@
       <w:r>
         <w:drawing>
           <wp:inline>
-            <wp:extent cx="5394960" cy="2562606"/>
-            <wp:docPr id="10" name="Picture 10"/>
+            <wp:extent cx="5394960" cy="1871377"/>
+            <wp:docPr id="12" name="Picture 12"/>
             <wp:cNvGraphicFramePr>
               <a:graphicFrameLocks noChangeAspect="1"/>
             </wp:cNvGraphicFramePr>
@@ -9401,7 +9401,7 @@
                     <pic:cNvPicPr/>
                   </pic:nvPicPr>
                   <pic:blipFill>
-                    <a:blip r:embed="rId15"/>
+                    <a:blip r:embed="rId18"/>
                     <a:stretch>
                       <a:fillRect/>
                     </a:stretch>
@@ -9409,7 +9409,7 @@
                   <pic:spPr>
                     <a:xfrm>
                       <a:off x="0" y="0"/>
-                      <a:ext cx="5394960" cy="2562606"/>
+                      <a:ext cx="5394960" cy="1871377"/>
                     </a:xfrm>
                     <a:prstGeom prst="rect"/>
                   </pic:spPr>

</xml_diff>